<commit_message>
análise dos primeiros gráficos
</commit_message>
<xml_diff>
--- a/data/testes_de_alana/Análise dos Primeiros Gráficos.docx
+++ b/data/testes_de_alana/Análise dos Primeiros Gráficos.docx
@@ -130,7 +130,34 @@
       </w:r>
       <w:proofErr w:type="spellEnd"/>
       <w:r>
-        <w:t xml:space="preserve"> do CPF: esse valor é transformado para </w:t>
+        <w:t xml:space="preserve"> do CPF</w:t>
+      </w:r>
+      <w:r>
+        <w:t xml:space="preserve">, agora </w:t>
+      </w:r>
+      <w:r>
+        <w:t>esse valor é transformado para Long.</w:t>
+      </w:r>
+    </w:p>
+    <w:p>
+      <w:pPr>
+        <w:pStyle w:val="PargrafodaLista"/>
+        <w:numPr>
+          <w:ilvl w:val="1"/>
+          <w:numId w:val="2"/>
+        </w:numPr>
+        <w:jc w:val="both"/>
+      </w:pPr>
+      <w:r>
+        <w:t xml:space="preserve">Se os CPFs inseridos possuem prefixos semelhantes, a ordenação lexicográfica de </w:t>
+      </w:r>
+      <w:proofErr w:type="spellStart"/>
+      <w:r>
+        <w:t>Strings</w:t>
+      </w:r>
+      <w:proofErr w:type="spellEnd"/>
+      <w:r>
+        <w:t xml:space="preserve"> pode criar ramos mais profundos, enquanto que a ordenação usando </w:t>
       </w:r>
       <w:proofErr w:type="spellStart"/>
       <w:r>
@@ -138,8 +165,34 @@
       </w:r>
       <w:proofErr w:type="spellEnd"/>
       <w:r>
-        <w:t>, isso faz com que o rebalanceamento da árvore interna não seja tão custoso.</w:t>
-      </w:r>
+        <w:t xml:space="preserve"> será baseada no seu valor numérico.</w:t>
+      </w:r>
+    </w:p>
+    <w:p>
+      <w:pPr>
+        <w:pStyle w:val="PargrafodaLista"/>
+        <w:numPr>
+          <w:ilvl w:val="1"/>
+          <w:numId w:val="2"/>
+        </w:numPr>
+        <w:jc w:val="both"/>
+      </w:pPr>
+      <w:r>
+        <w:t xml:space="preserve">Comparar </w:t>
+      </w:r>
+      <w:proofErr w:type="spellStart"/>
+      <w:r>
+        <w:t>Strings</w:t>
+      </w:r>
+      <w:proofErr w:type="spellEnd"/>
+      <w:r>
+        <w:t xml:space="preserve"> costuma ser mais caro computacionalmente do que compara valores </w:t>
+      </w:r>
+      <w:proofErr w:type="spellStart"/>
+      <w:r>
+        <w:t>Long</w:t>
+      </w:r>
+      <w:proofErr w:type="spellEnd"/>
     </w:p>
     <w:p>
       <w:pPr>
@@ -151,7 +204,18 @@
         <w:jc w:val="both"/>
       </w:pPr>
       <w:r>
-        <w:t xml:space="preserve">Os métodos </w:t>
+        <w:t xml:space="preserve">Dentro do método </w:t>
+      </w:r>
+      <w:proofErr w:type="spellStart"/>
+      <w:r>
+        <w:t>adicionaEstudante</w:t>
+      </w:r>
+      <w:proofErr w:type="spellEnd"/>
+      <w:r>
+        <w:t>(), as chamadas para</w:t>
+      </w:r>
+      <w:r>
+        <w:t xml:space="preserve"> </w:t>
       </w:r>
       <w:proofErr w:type="spellStart"/>
       <w:r>
@@ -167,7 +231,31 @@
       </w:r>
       <w:proofErr w:type="spellEnd"/>
       <w:r>
-        <w:t xml:space="preserve">() foram substituídos pelo único método </w:t>
+        <w:t>() foram substituíd</w:t>
+      </w:r>
+      <w:r>
+        <w:t>a</w:t>
+      </w:r>
+      <w:r>
+        <w:t>s pel</w:t>
+      </w:r>
+      <w:r>
+        <w:t>a</w:t>
+      </w:r>
+      <w:r>
+        <w:t xml:space="preserve"> únic</w:t>
+      </w:r>
+      <w:r>
+        <w:t>a</w:t>
+      </w:r>
+      <w:r>
+        <w:t xml:space="preserve"> </w:t>
+      </w:r>
+      <w:r>
+        <w:t>chamada</w:t>
+      </w:r>
+      <w:r>
+        <w:t xml:space="preserve"> </w:t>
       </w:r>
       <w:proofErr w:type="spellStart"/>
       <w:r>
@@ -175,7 +263,36 @@
       </w:r>
       <w:proofErr w:type="spellEnd"/>
       <w:r>
-        <w:t>(): dessa forma diminuímos o tempo que era usado em 2 travessias pela árvore.</w:t>
+        <w:t>().</w:t>
+      </w:r>
+    </w:p>
+    <w:p>
+      <w:pPr>
+        <w:pStyle w:val="PargrafodaLista"/>
+        <w:numPr>
+          <w:ilvl w:val="1"/>
+          <w:numId w:val="2"/>
+        </w:numPr>
+        <w:jc w:val="both"/>
+      </w:pPr>
+      <w:r>
+        <w:t>A primeira abordagem executa duas travessias na árvore (uma para verificar se ela contém aquela suposta nova chave e outra para adicionar o novo valor). A nova abordagem executa apenas uma travessia com um único método.</w:t>
+      </w:r>
+    </w:p>
+    <w:p>
+      <w:pPr>
+        <w:pStyle w:val="PargrafodaLista"/>
+        <w:numPr>
+          <w:ilvl w:val="1"/>
+          <w:numId w:val="2"/>
+        </w:numPr>
+        <w:jc w:val="both"/>
+      </w:pPr>
+      <w:r>
+        <w:t xml:space="preserve">A operação se torna atômica, então em atividades concorrentes, uma outra thread não conseguirá adicionar um novo usuário </w:t>
+      </w:r>
+      <w:r>
+        <w:t>entre a verificação e a inserção.</w:t>
       </w:r>
     </w:p>
     <w:p>
@@ -508,6 +625,7 @@
         <w:jc w:val="both"/>
       </w:pPr>
       <w:r>
+        <w:lastRenderedPageBreak/>
         <w:t xml:space="preserve">Método: </w:t>
       </w:r>
       <w:proofErr w:type="spellStart"/>
@@ -740,596 +858,596 @@
         <w:jc w:val="both"/>
       </w:pPr>
       <w:r>
+        <w:t xml:space="preserve">Assim, espera-se uma taxa de variação do tempo médio de execução proporcional a </w:t>
+      </w:r>
+      <w:proofErr w:type="spellStart"/>
+      <w:r>
+        <w:t>logn</w:t>
+      </w:r>
+      <w:proofErr w:type="spellEnd"/>
+      <w:r>
+        <w:t>, co</w:t>
+      </w:r>
+      <w:r>
+        <w:t xml:space="preserve">mo a carga cresce em uma razão de 3, </w:t>
+      </w:r>
+      <w:r>
+        <w:t>algo</w:t>
+      </w:r>
+      <w:r>
+        <w:t xml:space="preserve"> entre 1 a 1,3%</w:t>
+      </w:r>
+      <w:r>
+        <w:t>.</w:t>
+      </w:r>
+    </w:p>
+    <w:p>
+      <w:pPr>
+        <w:pStyle w:val="PargrafodaLista"/>
+        <w:numPr>
+          <w:ilvl w:val="1"/>
+          <w:numId w:val="1"/>
+        </w:numPr>
+        <w:jc w:val="both"/>
+      </w:pPr>
+      <w:r>
+        <w:t>Comportamento obtido:</w:t>
+      </w:r>
+    </w:p>
+    <w:p>
+      <w:pPr>
+        <w:pStyle w:val="PargrafodaLista"/>
+        <w:numPr>
+          <w:ilvl w:val="2"/>
+          <w:numId w:val="1"/>
+        </w:numPr>
+        <w:jc w:val="both"/>
+      </w:pPr>
+      <w:r>
+        <w:t xml:space="preserve">A taxa de variação foi de até </w:t>
+      </w:r>
+      <w:r>
+        <w:t>1,5</w:t>
+      </w:r>
+      <w:r>
+        <w:t>%, o que condiz com o que é esperado</w:t>
+      </w:r>
+    </w:p>
+    <w:p>
+      <w:pPr>
+        <w:jc w:val="both"/>
+      </w:pPr>
+    </w:p>
+    <w:p>
+      <w:pPr>
+        <w:pStyle w:val="PargrafodaLista"/>
+        <w:numPr>
+          <w:ilvl w:val="0"/>
+          <w:numId w:val="1"/>
+        </w:numPr>
+        <w:jc w:val="both"/>
+      </w:pPr>
+      <w:r>
+        <w:t xml:space="preserve">Método: </w:t>
+      </w:r>
+      <w:proofErr w:type="spellStart"/>
+      <w:r>
+        <w:t>public</w:t>
+      </w:r>
+      <w:proofErr w:type="spellEnd"/>
+      <w:r>
+        <w:t xml:space="preserve"> </w:t>
+      </w:r>
+      <w:proofErr w:type="spellStart"/>
+      <w:r>
+        <w:t>String</w:t>
+      </w:r>
+      <w:proofErr w:type="spellEnd"/>
+      <w:r>
+        <w:t xml:space="preserve">[] </w:t>
+      </w:r>
+      <w:proofErr w:type="spellStart"/>
+      <w:r>
+        <w:t>listaEstudantes</w:t>
+      </w:r>
+      <w:proofErr w:type="spellEnd"/>
+      <w:r>
+        <w:t>() {}</w:t>
+      </w:r>
+    </w:p>
+    <w:p>
+      <w:pPr>
+        <w:pStyle w:val="PargrafodaLista"/>
+        <w:numPr>
+          <w:ilvl w:val="1"/>
+          <w:numId w:val="1"/>
+        </w:numPr>
+        <w:jc w:val="both"/>
+      </w:pPr>
+      <w:r>
+        <w:t>Comportamento esperado:</w:t>
+      </w:r>
+    </w:p>
+    <w:p>
+      <w:pPr>
+        <w:pStyle w:val="PargrafodaLista"/>
+        <w:numPr>
+          <w:ilvl w:val="2"/>
+          <w:numId w:val="1"/>
+        </w:numPr>
+        <w:jc w:val="both"/>
+      </w:pPr>
+      <w:r>
+        <w:t xml:space="preserve">Criação de um novo </w:t>
+      </w:r>
+      <w:proofErr w:type="spellStart"/>
+      <w:r>
+        <w:t>TreeMap</w:t>
+      </w:r>
+      <w:proofErr w:type="spellEnd"/>
+      <w:r>
+        <w:t>, ordenado pelo nome</w:t>
+      </w:r>
+      <w:r>
+        <w:t xml:space="preserve"> – O(1)</w:t>
+      </w:r>
+      <w:r>
+        <w:t>;</w:t>
+      </w:r>
+    </w:p>
+    <w:p>
+      <w:pPr>
+        <w:pStyle w:val="PargrafodaLista"/>
+        <w:numPr>
+          <w:ilvl w:val="2"/>
+          <w:numId w:val="1"/>
+        </w:numPr>
+        <w:jc w:val="both"/>
+      </w:pPr>
+      <w:r>
+        <w:t xml:space="preserve">Iterar sobre os n elementos do </w:t>
+      </w:r>
+      <w:proofErr w:type="spellStart"/>
+      <w:r>
+        <w:t>TreeMap</w:t>
+      </w:r>
+      <w:proofErr w:type="spellEnd"/>
+      <w:r>
+        <w:t xml:space="preserve"> original – O(n)</w:t>
+      </w:r>
+      <w:r>
+        <w:t>;</w:t>
+      </w:r>
+    </w:p>
+    <w:p>
+      <w:pPr>
+        <w:pStyle w:val="PargrafodaLista"/>
+        <w:numPr>
+          <w:ilvl w:val="2"/>
+          <w:numId w:val="1"/>
+        </w:numPr>
+        <w:jc w:val="both"/>
+      </w:pPr>
+      <w:r>
+        <w:t xml:space="preserve">Inserir, cada um desses n elementos, no novo </w:t>
+      </w:r>
+      <w:proofErr w:type="spellStart"/>
+      <w:r>
+        <w:t>TreeMap</w:t>
+      </w:r>
+      <w:proofErr w:type="spellEnd"/>
+      <w:r>
+        <w:t xml:space="preserve"> – O(</w:t>
+      </w:r>
+      <w:proofErr w:type="spellStart"/>
+      <w:r>
+        <w:t>logn</w:t>
+      </w:r>
+      <w:proofErr w:type="spellEnd"/>
+      <w:r>
+        <w:t>)</w:t>
+      </w:r>
+      <w:r>
+        <w:t>;</w:t>
+      </w:r>
+    </w:p>
+    <w:p>
+      <w:pPr>
+        <w:pStyle w:val="PargrafodaLista"/>
+        <w:numPr>
+          <w:ilvl w:val="2"/>
+          <w:numId w:val="1"/>
+        </w:numPr>
+        <w:jc w:val="both"/>
+      </w:pPr>
+      <w:r>
+        <w:t xml:space="preserve">Converter o novo </w:t>
+      </w:r>
+      <w:proofErr w:type="spellStart"/>
+      <w:r>
+        <w:t>TreeMap</w:t>
+      </w:r>
+      <w:proofErr w:type="spellEnd"/>
+      <w:r>
+        <w:t xml:space="preserve"> em um </w:t>
+      </w:r>
+      <w:proofErr w:type="spellStart"/>
+      <w:r>
+        <w:t>array</w:t>
+      </w:r>
+      <w:proofErr w:type="spellEnd"/>
+      <w:r>
+        <w:t xml:space="preserve"> de </w:t>
+      </w:r>
+      <w:proofErr w:type="spellStart"/>
+      <w:r>
+        <w:t>String</w:t>
+      </w:r>
+      <w:proofErr w:type="spellEnd"/>
+      <w:r>
+        <w:t xml:space="preserve"> – O(n)</w:t>
+      </w:r>
+      <w:r>
+        <w:t>;</w:t>
+      </w:r>
+    </w:p>
+    <w:p>
+      <w:pPr>
+        <w:pStyle w:val="PargrafodaLista"/>
+        <w:numPr>
+          <w:ilvl w:val="2"/>
+          <w:numId w:val="1"/>
+        </w:numPr>
+        <w:jc w:val="both"/>
+      </w:pPr>
+      <w:r>
+        <w:t xml:space="preserve">Complexidade geral da </w:t>
+      </w:r>
+      <w:r>
+        <w:t>listagem</w:t>
+      </w:r>
+      <w:r>
+        <w:t xml:space="preserve"> – O(</w:t>
+      </w:r>
+      <w:proofErr w:type="spellStart"/>
+      <w:r>
+        <w:t>nlogn</w:t>
+      </w:r>
+      <w:proofErr w:type="spellEnd"/>
+      <w:r>
+        <w:t>)</w:t>
+      </w:r>
+      <w:r>
+        <w:t>;</w:t>
+      </w:r>
+    </w:p>
+    <w:p>
+      <w:pPr>
+        <w:pStyle w:val="PargrafodaLista"/>
+        <w:numPr>
+          <w:ilvl w:val="2"/>
+          <w:numId w:val="1"/>
+        </w:numPr>
+        <w:jc w:val="both"/>
+      </w:pPr>
+      <w:r>
+        <w:t xml:space="preserve">Assim, espera-se uma taxa de variação do tempo médio de execução proporcional a </w:t>
+      </w:r>
+      <w:proofErr w:type="spellStart"/>
+      <w:r>
+        <w:t>nlogn</w:t>
+      </w:r>
+      <w:proofErr w:type="spellEnd"/>
+      <w:r>
+        <w:t xml:space="preserve">, como a carga cresce em uma razão de 3, algo entre </w:t>
+      </w:r>
+      <w:r>
+        <w:t>3 a 3,5</w:t>
+      </w:r>
+      <w:r>
+        <w:t>%.</w:t>
+      </w:r>
+    </w:p>
+    <w:p>
+      <w:pPr>
+        <w:pStyle w:val="PargrafodaLista"/>
+        <w:numPr>
+          <w:ilvl w:val="1"/>
+          <w:numId w:val="1"/>
+        </w:numPr>
+        <w:jc w:val="both"/>
+      </w:pPr>
+      <w:r>
+        <w:t>Comportamento obtido:</w:t>
+      </w:r>
+    </w:p>
+    <w:p>
+      <w:pPr>
+        <w:pStyle w:val="PargrafodaLista"/>
+        <w:numPr>
+          <w:ilvl w:val="2"/>
+          <w:numId w:val="1"/>
+        </w:numPr>
+        <w:jc w:val="both"/>
+      </w:pPr>
+      <w:r>
+        <w:t>A</w:t>
+      </w:r>
+      <w:r>
+        <w:t xml:space="preserve"> taxa de variação </w:t>
+      </w:r>
+      <w:r>
+        <w:t>foi de</w:t>
+      </w:r>
+      <w:r>
+        <w:t xml:space="preserve"> até 3,2%</w:t>
+      </w:r>
+      <w:r>
+        <w:t>, o que condiz com o que é esperado</w:t>
+      </w:r>
+    </w:p>
+    <w:p>
+      <w:pPr>
+        <w:jc w:val="both"/>
+      </w:pPr>
+    </w:p>
+    <w:p>
+      <w:pPr>
+        <w:pStyle w:val="PargrafodaLista"/>
+        <w:numPr>
+          <w:ilvl w:val="0"/>
+          <w:numId w:val="1"/>
+        </w:numPr>
+        <w:jc w:val="both"/>
+      </w:pPr>
+      <w:r>
+        <w:t xml:space="preserve">Método: </w:t>
+      </w:r>
+      <w:proofErr w:type="spellStart"/>
+      <w:r>
+        <w:t>public</w:t>
+      </w:r>
+      <w:proofErr w:type="spellEnd"/>
+      <w:r>
+        <w:t xml:space="preserve"> </w:t>
+      </w:r>
+      <w:proofErr w:type="spellStart"/>
+      <w:r>
+        <w:t>String</w:t>
+      </w:r>
+      <w:proofErr w:type="spellEnd"/>
+      <w:r>
+        <w:t xml:space="preserve">[] </w:t>
+      </w:r>
+      <w:proofErr w:type="spellStart"/>
+      <w:r>
+        <w:t>listaEstudantesRankingDicas</w:t>
+      </w:r>
+      <w:proofErr w:type="spellEnd"/>
+      <w:r>
+        <w:t>() {</w:t>
+      </w:r>
+      <w:r>
+        <w:t>}</w:t>
+      </w:r>
+    </w:p>
+    <w:p>
+      <w:pPr>
+        <w:pStyle w:val="PargrafodaLista"/>
+        <w:numPr>
+          <w:ilvl w:val="1"/>
+          <w:numId w:val="1"/>
+        </w:numPr>
+        <w:jc w:val="both"/>
+      </w:pPr>
+      <w:r>
+        <w:t>Comportamento esperado:</w:t>
+      </w:r>
+    </w:p>
+    <w:p>
+      <w:pPr>
+        <w:pStyle w:val="PargrafodaLista"/>
+        <w:numPr>
+          <w:ilvl w:val="2"/>
+          <w:numId w:val="1"/>
+        </w:numPr>
+        <w:jc w:val="both"/>
+      </w:pPr>
+      <w:r>
+        <w:t xml:space="preserve">Criação de um novo </w:t>
+      </w:r>
+      <w:proofErr w:type="spellStart"/>
+      <w:r>
+        <w:t>TreeMap</w:t>
+      </w:r>
+      <w:proofErr w:type="spellEnd"/>
+      <w:r>
+        <w:t xml:space="preserve">, ordenado pelo </w:t>
+      </w:r>
+      <w:r>
+        <w:t>bônus</w:t>
+      </w:r>
+      <w:r>
+        <w:t xml:space="preserve"> – O(1)</w:t>
+      </w:r>
+      <w:r>
+        <w:t>;</w:t>
+      </w:r>
+    </w:p>
+    <w:p>
+      <w:pPr>
+        <w:pStyle w:val="PargrafodaLista"/>
+        <w:numPr>
+          <w:ilvl w:val="2"/>
+          <w:numId w:val="1"/>
+        </w:numPr>
+        <w:jc w:val="both"/>
+      </w:pPr>
+      <w:r>
+        <w:t xml:space="preserve">Iterar sobre os n elementos do </w:t>
+      </w:r>
+      <w:proofErr w:type="spellStart"/>
+      <w:r>
+        <w:t>TreeMap</w:t>
+      </w:r>
+      <w:proofErr w:type="spellEnd"/>
+      <w:r>
+        <w:t xml:space="preserve"> original – O(n)</w:t>
+      </w:r>
+      <w:r>
+        <w:t>;</w:t>
+      </w:r>
+    </w:p>
+    <w:p>
+      <w:pPr>
+        <w:pStyle w:val="PargrafodaLista"/>
+        <w:numPr>
+          <w:ilvl w:val="2"/>
+          <w:numId w:val="1"/>
+        </w:numPr>
+        <w:jc w:val="both"/>
+      </w:pPr>
+      <w:r>
+        <w:t xml:space="preserve">Inserir, cada um desses n elementos, no novo </w:t>
+      </w:r>
+      <w:proofErr w:type="spellStart"/>
+      <w:r>
+        <w:t>TreeMap</w:t>
+      </w:r>
+      <w:proofErr w:type="spellEnd"/>
+      <w:r>
+        <w:t xml:space="preserve"> – O(</w:t>
+      </w:r>
+      <w:proofErr w:type="spellStart"/>
+      <w:r>
+        <w:t>logn</w:t>
+      </w:r>
+      <w:proofErr w:type="spellEnd"/>
+      <w:r>
+        <w:t>)</w:t>
+      </w:r>
+      <w:r>
+        <w:t>;</w:t>
+      </w:r>
+    </w:p>
+    <w:p>
+      <w:pPr>
+        <w:pStyle w:val="PargrafodaLista"/>
+        <w:numPr>
+          <w:ilvl w:val="2"/>
+          <w:numId w:val="1"/>
+        </w:numPr>
+        <w:jc w:val="both"/>
+      </w:pPr>
+      <w:r>
+        <w:t xml:space="preserve">Converter o novo </w:t>
+      </w:r>
+      <w:proofErr w:type="spellStart"/>
+      <w:r>
+        <w:t>TreeMap</w:t>
+      </w:r>
+      <w:proofErr w:type="spellEnd"/>
+      <w:r>
+        <w:t xml:space="preserve"> em um </w:t>
+      </w:r>
+      <w:proofErr w:type="spellStart"/>
+      <w:r>
+        <w:t>array</w:t>
+      </w:r>
+      <w:proofErr w:type="spellEnd"/>
+      <w:r>
+        <w:t xml:space="preserve"> de </w:t>
+      </w:r>
+      <w:proofErr w:type="spellStart"/>
+      <w:r>
+        <w:t>String</w:t>
+      </w:r>
+      <w:proofErr w:type="spellEnd"/>
+      <w:r>
+        <w:t xml:space="preserve"> – O(n)</w:t>
+      </w:r>
+      <w:r>
+        <w:t>;</w:t>
+      </w:r>
+    </w:p>
+    <w:p>
+      <w:pPr>
+        <w:pStyle w:val="PargrafodaLista"/>
+        <w:numPr>
+          <w:ilvl w:val="2"/>
+          <w:numId w:val="1"/>
+        </w:numPr>
+        <w:jc w:val="both"/>
+      </w:pPr>
+      <w:r>
+        <w:t xml:space="preserve">Complexidade geral da </w:t>
+      </w:r>
+      <w:r>
+        <w:t xml:space="preserve">listagem </w:t>
+      </w:r>
+      <w:r>
+        <w:t>– O(</w:t>
+      </w:r>
+      <w:proofErr w:type="spellStart"/>
+      <w:r>
+        <w:t>nlogn</w:t>
+      </w:r>
+      <w:proofErr w:type="spellEnd"/>
+      <w:r>
+        <w:t>)</w:t>
+      </w:r>
+      <w:r>
+        <w:t>;</w:t>
+      </w:r>
+    </w:p>
+    <w:p>
+      <w:pPr>
+        <w:pStyle w:val="PargrafodaLista"/>
+        <w:numPr>
+          <w:ilvl w:val="2"/>
+          <w:numId w:val="1"/>
+        </w:numPr>
+        <w:jc w:val="both"/>
+      </w:pPr>
+      <w:r>
+        <w:t xml:space="preserve">Assim, espera-se uma taxa de variação do tempo médio de execução proporcional a </w:t>
+      </w:r>
+      <w:proofErr w:type="spellStart"/>
+      <w:r>
+        <w:t>nlogn</w:t>
+      </w:r>
+      <w:proofErr w:type="spellEnd"/>
+      <w:r>
+        <w:t>, como a carga cresce em uma razão de 3, algo entre 3 a 3,5%.</w:t>
+      </w:r>
+    </w:p>
+    <w:p>
+      <w:pPr>
+        <w:pStyle w:val="PargrafodaLista"/>
+        <w:numPr>
+          <w:ilvl w:val="1"/>
+          <w:numId w:val="1"/>
+        </w:numPr>
+        <w:jc w:val="both"/>
+      </w:pPr>
+      <w:r>
+        <w:t>Comportamento obtido</w:t>
+      </w:r>
+      <w:r>
+        <w:t>:</w:t>
+      </w:r>
+    </w:p>
+    <w:p>
+      <w:pPr>
+        <w:pStyle w:val="PargrafodaLista"/>
+        <w:numPr>
+          <w:ilvl w:val="2"/>
+          <w:numId w:val="1"/>
+        </w:numPr>
+        <w:jc w:val="both"/>
+      </w:pPr>
+      <w:r>
         <w:lastRenderedPageBreak/>
-        <w:t xml:space="preserve">Assim, espera-se uma taxa de variação do tempo médio de execução proporcional a </w:t>
-      </w:r>
-      <w:proofErr w:type="spellStart"/>
-      <w:r>
-        <w:t>logn</w:t>
-      </w:r>
-      <w:proofErr w:type="spellEnd"/>
-      <w:r>
-        <w:t>, co</w:t>
-      </w:r>
-      <w:r>
-        <w:t xml:space="preserve">mo a carga cresce em uma razão de 3, </w:t>
-      </w:r>
-      <w:r>
-        <w:t>algo</w:t>
-      </w:r>
-      <w:r>
-        <w:t xml:space="preserve"> entre 1 a 1,3%</w:t>
-      </w:r>
-      <w:r>
-        <w:t>.</w:t>
-      </w:r>
-    </w:p>
-    <w:p>
-      <w:pPr>
-        <w:pStyle w:val="PargrafodaLista"/>
-        <w:numPr>
-          <w:ilvl w:val="1"/>
-          <w:numId w:val="1"/>
-        </w:numPr>
-        <w:jc w:val="both"/>
-      </w:pPr>
-      <w:r>
-        <w:t>Comportamento obtido:</w:t>
-      </w:r>
-    </w:p>
-    <w:p>
-      <w:pPr>
-        <w:pStyle w:val="PargrafodaLista"/>
-        <w:numPr>
-          <w:ilvl w:val="2"/>
-          <w:numId w:val="1"/>
-        </w:numPr>
-        <w:jc w:val="both"/>
-      </w:pPr>
-      <w:r>
-        <w:t xml:space="preserve">A taxa de variação foi de até </w:t>
-      </w:r>
-      <w:r>
-        <w:t>1,5</w:t>
-      </w:r>
-      <w:r>
-        <w:t>%, o que condiz com o que é esperado</w:t>
-      </w:r>
-    </w:p>
-    <w:p>
-      <w:pPr>
-        <w:jc w:val="both"/>
-      </w:pPr>
-    </w:p>
-    <w:p>
-      <w:pPr>
-        <w:pStyle w:val="PargrafodaLista"/>
-        <w:numPr>
-          <w:ilvl w:val="0"/>
-          <w:numId w:val="1"/>
-        </w:numPr>
-        <w:jc w:val="both"/>
-      </w:pPr>
-      <w:r>
-        <w:t xml:space="preserve">Método: </w:t>
-      </w:r>
-      <w:proofErr w:type="spellStart"/>
-      <w:r>
-        <w:t>public</w:t>
-      </w:r>
-      <w:proofErr w:type="spellEnd"/>
-      <w:r>
-        <w:t xml:space="preserve"> </w:t>
-      </w:r>
-      <w:proofErr w:type="spellStart"/>
-      <w:r>
-        <w:t>String</w:t>
-      </w:r>
-      <w:proofErr w:type="spellEnd"/>
-      <w:r>
-        <w:t xml:space="preserve">[] </w:t>
-      </w:r>
-      <w:proofErr w:type="spellStart"/>
-      <w:r>
-        <w:t>listaEstudantes</w:t>
-      </w:r>
-      <w:proofErr w:type="spellEnd"/>
-      <w:r>
-        <w:t>() {}</w:t>
-      </w:r>
-    </w:p>
-    <w:p>
-      <w:pPr>
-        <w:pStyle w:val="PargrafodaLista"/>
-        <w:numPr>
-          <w:ilvl w:val="1"/>
-          <w:numId w:val="1"/>
-        </w:numPr>
-        <w:jc w:val="both"/>
-      </w:pPr>
-      <w:r>
-        <w:t>Comportamento esperado:</w:t>
-      </w:r>
-    </w:p>
-    <w:p>
-      <w:pPr>
-        <w:pStyle w:val="PargrafodaLista"/>
-        <w:numPr>
-          <w:ilvl w:val="2"/>
-          <w:numId w:val="1"/>
-        </w:numPr>
-        <w:jc w:val="both"/>
-      </w:pPr>
-      <w:r>
-        <w:t xml:space="preserve">Criação de um novo </w:t>
-      </w:r>
-      <w:proofErr w:type="spellStart"/>
-      <w:r>
-        <w:t>TreeMap</w:t>
-      </w:r>
-      <w:proofErr w:type="spellEnd"/>
-      <w:r>
-        <w:t>, ordenado pelo nome</w:t>
-      </w:r>
-      <w:r>
-        <w:t xml:space="preserve"> – O(1)</w:t>
-      </w:r>
-      <w:r>
-        <w:t>;</w:t>
-      </w:r>
-    </w:p>
-    <w:p>
-      <w:pPr>
-        <w:pStyle w:val="PargrafodaLista"/>
-        <w:numPr>
-          <w:ilvl w:val="2"/>
-          <w:numId w:val="1"/>
-        </w:numPr>
-        <w:jc w:val="both"/>
-      </w:pPr>
-      <w:r>
-        <w:t xml:space="preserve">Iterar sobre os n elementos do </w:t>
-      </w:r>
-      <w:proofErr w:type="spellStart"/>
-      <w:r>
-        <w:t>TreeMap</w:t>
-      </w:r>
-      <w:proofErr w:type="spellEnd"/>
-      <w:r>
-        <w:t xml:space="preserve"> original – O(n)</w:t>
-      </w:r>
-      <w:r>
-        <w:t>;</w:t>
-      </w:r>
-    </w:p>
-    <w:p>
-      <w:pPr>
-        <w:pStyle w:val="PargrafodaLista"/>
-        <w:numPr>
-          <w:ilvl w:val="2"/>
-          <w:numId w:val="1"/>
-        </w:numPr>
-        <w:jc w:val="both"/>
-      </w:pPr>
-      <w:r>
-        <w:t xml:space="preserve">Inserir, cada um desses n elementos, no novo </w:t>
-      </w:r>
-      <w:proofErr w:type="spellStart"/>
-      <w:r>
-        <w:t>TreeMap</w:t>
-      </w:r>
-      <w:proofErr w:type="spellEnd"/>
-      <w:r>
-        <w:t xml:space="preserve"> – O(</w:t>
-      </w:r>
-      <w:proofErr w:type="spellStart"/>
-      <w:r>
-        <w:t>logn</w:t>
-      </w:r>
-      <w:proofErr w:type="spellEnd"/>
-      <w:r>
-        <w:t>)</w:t>
-      </w:r>
-      <w:r>
-        <w:t>;</w:t>
-      </w:r>
-    </w:p>
-    <w:p>
-      <w:pPr>
-        <w:pStyle w:val="PargrafodaLista"/>
-        <w:numPr>
-          <w:ilvl w:val="2"/>
-          <w:numId w:val="1"/>
-        </w:numPr>
-        <w:jc w:val="both"/>
-      </w:pPr>
-      <w:r>
-        <w:t xml:space="preserve">Converter o novo </w:t>
-      </w:r>
-      <w:proofErr w:type="spellStart"/>
-      <w:r>
-        <w:t>TreeMap</w:t>
-      </w:r>
-      <w:proofErr w:type="spellEnd"/>
-      <w:r>
-        <w:t xml:space="preserve"> em um </w:t>
-      </w:r>
-      <w:proofErr w:type="spellStart"/>
-      <w:r>
-        <w:t>array</w:t>
-      </w:r>
-      <w:proofErr w:type="spellEnd"/>
-      <w:r>
-        <w:t xml:space="preserve"> de </w:t>
-      </w:r>
-      <w:proofErr w:type="spellStart"/>
-      <w:r>
-        <w:t>String</w:t>
-      </w:r>
-      <w:proofErr w:type="spellEnd"/>
-      <w:r>
-        <w:t xml:space="preserve"> – O(n)</w:t>
-      </w:r>
-      <w:r>
-        <w:t>;</w:t>
-      </w:r>
-    </w:p>
-    <w:p>
-      <w:pPr>
-        <w:pStyle w:val="PargrafodaLista"/>
-        <w:numPr>
-          <w:ilvl w:val="2"/>
-          <w:numId w:val="1"/>
-        </w:numPr>
-        <w:jc w:val="both"/>
-      </w:pPr>
-      <w:r>
-        <w:t xml:space="preserve">Complexidade geral da </w:t>
-      </w:r>
-      <w:r>
-        <w:t>listagem</w:t>
-      </w:r>
-      <w:r>
-        <w:t xml:space="preserve"> – O(</w:t>
-      </w:r>
-      <w:proofErr w:type="spellStart"/>
-      <w:r>
-        <w:t>nlogn</w:t>
-      </w:r>
-      <w:proofErr w:type="spellEnd"/>
-      <w:r>
-        <w:t>)</w:t>
-      </w:r>
-      <w:r>
-        <w:t>;</w:t>
-      </w:r>
-    </w:p>
-    <w:p>
-      <w:pPr>
-        <w:pStyle w:val="PargrafodaLista"/>
-        <w:numPr>
-          <w:ilvl w:val="2"/>
-          <w:numId w:val="1"/>
-        </w:numPr>
-        <w:jc w:val="both"/>
-      </w:pPr>
-      <w:r>
-        <w:t xml:space="preserve">Assim, espera-se uma taxa de variação do tempo médio de execução proporcional a </w:t>
-      </w:r>
-      <w:proofErr w:type="spellStart"/>
-      <w:r>
-        <w:t>nlogn</w:t>
-      </w:r>
-      <w:proofErr w:type="spellEnd"/>
-      <w:r>
-        <w:t xml:space="preserve">, como a carga cresce em uma razão de 3, algo entre </w:t>
-      </w:r>
-      <w:r>
-        <w:t>3 a 3,5</w:t>
-      </w:r>
-      <w:r>
-        <w:t>%.</w:t>
-      </w:r>
-    </w:p>
-    <w:p>
-      <w:pPr>
-        <w:pStyle w:val="PargrafodaLista"/>
-        <w:numPr>
-          <w:ilvl w:val="1"/>
-          <w:numId w:val="1"/>
-        </w:numPr>
-        <w:jc w:val="both"/>
-      </w:pPr>
-      <w:r>
-        <w:t>Comportamento obtido:</w:t>
-      </w:r>
-    </w:p>
-    <w:p>
-      <w:pPr>
-        <w:pStyle w:val="PargrafodaLista"/>
-        <w:numPr>
-          <w:ilvl w:val="2"/>
-          <w:numId w:val="1"/>
-        </w:numPr>
-        <w:jc w:val="both"/>
-      </w:pPr>
-      <w:r>
-        <w:t>A</w:t>
-      </w:r>
-      <w:r>
-        <w:t xml:space="preserve"> taxa de variação </w:t>
-      </w:r>
-      <w:r>
-        <w:t>foi de</w:t>
-      </w:r>
-      <w:r>
-        <w:t xml:space="preserve"> até 3,2%</w:t>
-      </w:r>
-      <w:r>
-        <w:t>, o que condiz com o que é esperado</w:t>
-      </w:r>
-    </w:p>
-    <w:p>
-      <w:pPr>
-        <w:jc w:val="both"/>
-      </w:pPr>
-    </w:p>
-    <w:p>
-      <w:pPr>
-        <w:pStyle w:val="PargrafodaLista"/>
-        <w:numPr>
-          <w:ilvl w:val="0"/>
-          <w:numId w:val="1"/>
-        </w:numPr>
-        <w:jc w:val="both"/>
-      </w:pPr>
-      <w:r>
-        <w:t xml:space="preserve">Método: </w:t>
-      </w:r>
-      <w:proofErr w:type="spellStart"/>
-      <w:r>
-        <w:t>public</w:t>
-      </w:r>
-      <w:proofErr w:type="spellEnd"/>
-      <w:r>
-        <w:t xml:space="preserve"> </w:t>
-      </w:r>
-      <w:proofErr w:type="spellStart"/>
-      <w:r>
-        <w:t>String</w:t>
-      </w:r>
-      <w:proofErr w:type="spellEnd"/>
-      <w:r>
-        <w:t xml:space="preserve">[] </w:t>
-      </w:r>
-      <w:proofErr w:type="spellStart"/>
-      <w:r>
-        <w:t>listaEstudantesRankingDicas</w:t>
-      </w:r>
-      <w:proofErr w:type="spellEnd"/>
-      <w:r>
-        <w:t>() {</w:t>
-      </w:r>
-      <w:r>
-        <w:t>}</w:t>
-      </w:r>
-    </w:p>
-    <w:p>
-      <w:pPr>
-        <w:pStyle w:val="PargrafodaLista"/>
-        <w:numPr>
-          <w:ilvl w:val="1"/>
-          <w:numId w:val="1"/>
-        </w:numPr>
-        <w:jc w:val="both"/>
-      </w:pPr>
-      <w:r>
-        <w:t>Comportamento esperado:</w:t>
-      </w:r>
-    </w:p>
-    <w:p>
-      <w:pPr>
-        <w:pStyle w:val="PargrafodaLista"/>
-        <w:numPr>
-          <w:ilvl w:val="2"/>
-          <w:numId w:val="1"/>
-        </w:numPr>
-        <w:jc w:val="both"/>
-      </w:pPr>
-      <w:r>
-        <w:t xml:space="preserve">Criação de um novo </w:t>
-      </w:r>
-      <w:proofErr w:type="spellStart"/>
-      <w:r>
-        <w:t>TreeMap</w:t>
-      </w:r>
-      <w:proofErr w:type="spellEnd"/>
-      <w:r>
-        <w:t xml:space="preserve">, ordenado pelo </w:t>
-      </w:r>
-      <w:r>
-        <w:t>bônus</w:t>
-      </w:r>
-      <w:r>
-        <w:t xml:space="preserve"> – O(1)</w:t>
-      </w:r>
-      <w:r>
-        <w:t>;</w:t>
-      </w:r>
-    </w:p>
-    <w:p>
-      <w:pPr>
-        <w:pStyle w:val="PargrafodaLista"/>
-        <w:numPr>
-          <w:ilvl w:val="2"/>
-          <w:numId w:val="1"/>
-        </w:numPr>
-        <w:jc w:val="both"/>
-      </w:pPr>
-      <w:r>
-        <w:t xml:space="preserve">Iterar sobre os n elementos do </w:t>
-      </w:r>
-      <w:proofErr w:type="spellStart"/>
-      <w:r>
-        <w:t>TreeMap</w:t>
-      </w:r>
-      <w:proofErr w:type="spellEnd"/>
-      <w:r>
-        <w:t xml:space="preserve"> original – O(n)</w:t>
-      </w:r>
-      <w:r>
-        <w:t>;</w:t>
-      </w:r>
-    </w:p>
-    <w:p>
-      <w:pPr>
-        <w:pStyle w:val="PargrafodaLista"/>
-        <w:numPr>
-          <w:ilvl w:val="2"/>
-          <w:numId w:val="1"/>
-        </w:numPr>
-        <w:jc w:val="both"/>
-      </w:pPr>
-      <w:r>
-        <w:t xml:space="preserve">Inserir, cada um desses n elementos, no novo </w:t>
-      </w:r>
-      <w:proofErr w:type="spellStart"/>
-      <w:r>
-        <w:t>TreeMap</w:t>
-      </w:r>
-      <w:proofErr w:type="spellEnd"/>
-      <w:r>
-        <w:t xml:space="preserve"> – O(</w:t>
-      </w:r>
-      <w:proofErr w:type="spellStart"/>
-      <w:r>
-        <w:t>logn</w:t>
-      </w:r>
-      <w:proofErr w:type="spellEnd"/>
-      <w:r>
-        <w:t>)</w:t>
-      </w:r>
-      <w:r>
-        <w:t>;</w:t>
-      </w:r>
-    </w:p>
-    <w:p>
-      <w:pPr>
-        <w:pStyle w:val="PargrafodaLista"/>
-        <w:numPr>
-          <w:ilvl w:val="2"/>
-          <w:numId w:val="1"/>
-        </w:numPr>
-        <w:jc w:val="both"/>
-      </w:pPr>
-      <w:r>
-        <w:t xml:space="preserve">Converter o novo </w:t>
-      </w:r>
-      <w:proofErr w:type="spellStart"/>
-      <w:r>
-        <w:t>TreeMap</w:t>
-      </w:r>
-      <w:proofErr w:type="spellEnd"/>
-      <w:r>
-        <w:t xml:space="preserve"> em um </w:t>
-      </w:r>
-      <w:proofErr w:type="spellStart"/>
-      <w:r>
-        <w:t>array</w:t>
-      </w:r>
-      <w:proofErr w:type="spellEnd"/>
-      <w:r>
-        <w:t xml:space="preserve"> de </w:t>
-      </w:r>
-      <w:proofErr w:type="spellStart"/>
-      <w:r>
-        <w:t>String</w:t>
-      </w:r>
-      <w:proofErr w:type="spellEnd"/>
-      <w:r>
-        <w:t xml:space="preserve"> – O(n)</w:t>
-      </w:r>
-      <w:r>
-        <w:t>;</w:t>
-      </w:r>
-    </w:p>
-    <w:p>
-      <w:pPr>
-        <w:pStyle w:val="PargrafodaLista"/>
-        <w:numPr>
-          <w:ilvl w:val="2"/>
-          <w:numId w:val="1"/>
-        </w:numPr>
-        <w:jc w:val="both"/>
-      </w:pPr>
-      <w:r>
-        <w:t xml:space="preserve">Complexidade geral da </w:t>
-      </w:r>
-      <w:r>
-        <w:t xml:space="preserve">listagem </w:t>
-      </w:r>
-      <w:r>
-        <w:t>– O(</w:t>
-      </w:r>
-      <w:proofErr w:type="spellStart"/>
-      <w:r>
-        <w:t>nlogn</w:t>
-      </w:r>
-      <w:proofErr w:type="spellEnd"/>
-      <w:r>
-        <w:t>)</w:t>
-      </w:r>
-      <w:r>
-        <w:t>;</w:t>
-      </w:r>
-    </w:p>
-    <w:p>
-      <w:pPr>
-        <w:pStyle w:val="PargrafodaLista"/>
-        <w:numPr>
-          <w:ilvl w:val="2"/>
-          <w:numId w:val="1"/>
-        </w:numPr>
-        <w:jc w:val="both"/>
-      </w:pPr>
-      <w:r>
-        <w:t xml:space="preserve">Assim, espera-se uma taxa de variação do tempo médio de execução proporcional a </w:t>
-      </w:r>
-      <w:proofErr w:type="spellStart"/>
-      <w:r>
-        <w:t>nlogn</w:t>
-      </w:r>
-      <w:proofErr w:type="spellEnd"/>
-      <w:r>
-        <w:t>, como a carga cresce em uma razão de 3, algo entre 3 a 3,5%.</w:t>
-      </w:r>
-    </w:p>
-    <w:p>
-      <w:pPr>
-        <w:pStyle w:val="PargrafodaLista"/>
-        <w:numPr>
-          <w:ilvl w:val="1"/>
-          <w:numId w:val="1"/>
-        </w:numPr>
-        <w:jc w:val="both"/>
-      </w:pPr>
-      <w:r>
-        <w:t>Comportamento obtido</w:t>
-      </w:r>
-      <w:r>
-        <w:t>:</w:t>
-      </w:r>
-    </w:p>
-    <w:p>
-      <w:pPr>
-        <w:pStyle w:val="PargrafodaLista"/>
-        <w:numPr>
-          <w:ilvl w:val="2"/>
-          <w:numId w:val="1"/>
-        </w:numPr>
-        <w:jc w:val="both"/>
-      </w:pPr>
-      <w:r>
         <w:t xml:space="preserve"> </w:t>
       </w:r>
       <w:r>
@@ -1444,7 +1562,32 @@
       </w:r>
       <w:proofErr w:type="spellEnd"/>
       <w:r>
-        <w:t>( dependendo da posição procurada: as buscas pela primeira e pela última dica são otimizadas.</w:t>
+        <w:t>(</w:t>
+      </w:r>
+      <w:r>
+        <w:t>)</w:t>
+      </w:r>
+      <w:r>
+        <w:t xml:space="preserve"> dependendo da posição procurada.</w:t>
+      </w:r>
+    </w:p>
+    <w:p>
+      <w:pPr>
+        <w:pStyle w:val="PargrafodaLista"/>
+        <w:numPr>
+          <w:ilvl w:val="1"/>
+          <w:numId w:val="3"/>
+        </w:numPr>
+        <w:jc w:val="both"/>
+      </w:pPr>
+      <w:r>
+        <w:t xml:space="preserve">A busca intermediária continua sendo proporcional ao tamanho da carga, porém ela é </w:t>
+      </w:r>
+      <w:r>
+        <w:t xml:space="preserve">drasticamente </w:t>
+      </w:r>
+      <w:r>
+        <w:t>otimizada para posições específicas (primeira e última).</w:t>
       </w:r>
     </w:p>
     <w:p>
@@ -1824,7 +1967,7 @@
         <w:rFonts w:hint="default"/>
       </w:rPr>
     </w:lvl>
-    <w:lvl w:ilvl="1" w:tplc="04160019" w:tentative="1">
+    <w:lvl w:ilvl="1" w:tplc="04160019">
       <w:start w:val="1"/>
       <w:numFmt w:val="lowerLetter"/>
       <w:lvlText w:val="%2."/>
@@ -1913,7 +2056,7 @@
         <w:rFonts w:hint="default"/>
       </w:rPr>
     </w:lvl>
-    <w:lvl w:ilvl="1" w:tplc="04160019" w:tentative="1">
+    <w:lvl w:ilvl="1" w:tplc="04160019">
       <w:start w:val="1"/>
       <w:numFmt w:val="lowerLetter"/>
       <w:lvlText w:val="%2."/>

</xml_diff>